<commit_message>
Add Orbis Ingestion Compatible tab (multi-source GDB/GPKG/Excel/CSV template match)
Adds a new 4th tab that merges one or more sources into a single output
GeoPackage matching an exact Orbis reference template (Area, Postal Area,
or POR): field names, order, width, geometry type, and coordinate
rounding. Includes a v1-suffix layer-name matching fix and openpyxl for
Excel input. Docs (Quick Start Guide, README) updated to match.
</commit_message>
<xml_diff>
--- a/GeoConverter_Shareable/Quick_Start_Guide.docx
+++ b/GeoConverter_Shareable/Quick_Start_Guide.docx
@@ -209,6 +209,28 @@
                 <w:sz w:val="20"/>
               </w:rPr>
               <w:t>Convert TTOM-format GeoJSON files to FileGDB</w:t>
+            </w:r>
+          </w:p>
+        </w:tc>
+      </w:tr>
+      <w:tr>
+        <w:tc>
+          <w:tcPr>
+            <w:tcW w:type="dxa" w:w="4536"/>
+          </w:tcPr>
+          <w:p>
+            <w:r>
+              <w:t>📐  Orbis Ingestion Compatible</w:t>
+            </w:r>
+          </w:p>
+        </w:tc>
+        <w:tc>
+          <w:tcPr>
+            <w:tcW w:type="dxa" w:w="4536"/>
+          </w:tcPr>
+          <w:p>
+            <w:r>
+              <w:t>Merge GDB/GPKG/Excel/CSV sources into one GPKG matching an exact Orbis reference template (Area / Postal Area / POR)</w:t>
             </w:r>
           </w:p>
         </w:tc>
@@ -1078,6 +1100,69 @@
     </w:p>
     <w:p>
       <w:pPr>
+        <w:pStyle w:val="Heading2"/>
+      </w:pPr>
+      <w:r>
+        <w:t>Tab 4 — Orbis Ingestion Compatible</w:t>
+      </w:r>
+    </w:p>
+    <w:p>
+      <w:pPr/>
+      <w:r>
+        <w:t>Convert one or more sources — GDB, GPKG, Excel, or CSV — into a single merged GeoPackage that exactly matches an Orbis reference template (Area, Postal Area, or POR): field names, order, width, geometry type, and coordinate rounding (X/Y precision 7).</w:t>
+      </w:r>
+    </w:p>
+    <w:p>
+      <w:pPr>
+        <w:pStyle w:val="ListNumber"/>
+      </w:pPr>
+      <w:r>
+        <w:t>Click Browse file(s) or Browse folder to add one or more source files. You can add a GDB plus supplementary Excel/CSV files — they are merged into one layer pool before conversion.</w:t>
+      </w:r>
+    </w:p>
+    <w:p>
+      <w:pPr>
+        <w:pStyle w:val="ListNumber"/>
+      </w:pPr>
+      <w:r>
+        <w:t>Choose the Reference template: Area, Postal Area, or POR.</w:t>
+      </w:r>
+    </w:p>
+    <w:p>
+      <w:pPr>
+        <w:pStyle w:val="ListNumber"/>
+      </w:pPr>
+      <w:r>
+        <w:t>Review Select Layers — each input layer/sheet is automatically matched to a template by geometry type and name similarity. Uncheck any layer you do not want included.</w:t>
+      </w:r>
+    </w:p>
+    <w:p>
+      <w:pPr>
+        <w:pStyle w:val="ListNumber"/>
+      </w:pPr>
+      <w:r>
+        <w:t>Set the Output GPKG path.</w:t>
+      </w:r>
+    </w:p>
+    <w:p>
+      <w:pPr>
+        <w:pStyle w:val="ListNumber"/>
+      </w:pPr>
+      <w:r>
+        <w:t>Click Convert to Template GPKG.</w:t>
+      </w:r>
+    </w:p>
+    <w:p>
+      <w:pPr/>
+      <w:r>
+        <w:t>ℹ  Any input field not present in the reference template is dropped automatically; layers with no template match are listed as skipped rather than guessed at.</w:t>
+      </w:r>
+    </w:p>
+    <w:p>
+      <w:pPr/>
+    </w:p>
+    <w:p>
+      <w:pPr>
         <w:pStyle w:val="Heading1"/>
         <w:spacing w:before="200" w:after="80"/>
       </w:pPr>

</xml_diff>